<commit_message>
Update portfolio for completed EdD
</commit_message>
<xml_diff>
--- a/assets/docs/Justin_Barczewski_Resume.docx
+++ b/assets/docs/Justin_Barczewski_Resume.docx
@@ -17,6 +17,17 @@
           <w:szCs w:val="32"/>
         </w:rPr>
         <w:t>JUSTIN BARCZEWSKI</w:t>
+      </w:r>
+      <w:r>
+        <w:rPr>
+          <w:b/>
+          <w:bCs/>
+          <w:color w:val="1F2A44"/>
+          <w:spacing w:val="30"/>
+          <w:sz w:val="32"/>
+          <w:szCs w:val="32"/>
+        </w:rPr>
+        <w:t>, Ed.D.</w:t>
       </w:r>
     </w:p>
     <w:p>
@@ -134,7 +145,7 @@
         <w:spacing w:after="60" w:line="252" w:lineRule="auto"/>
       </w:pPr>
       <w:r>
-        <w:t>Educational leader and doctoral candidate in education (EdD, expected August 2026) specializing in higher education, instructional design, and adult learning, with 10+ years of experience developing and facilitating training that builds measurable knowledge, skills, and performance outcomes. Scholar-practitioner grounded theory research, curriculum development, and learner assessment with enterprise project leadership, Agile/Scrum delivery, and data-informed decision-making. Certified ScrumMaster (CSM) with active federal security clearance. Experienced leading cross-functional teams and knowledge-transfer initiatives across complex, high-stakes environments. Seeks to apply educational leadership and program-development expertise to advance teaching, learning, and organizational effectiveness in higher education.</w:t>
+        <w:t>Doctor of Education (EdD) in Educational Leadership with a focus on higher education, instructional design, and adult learning, and 10+ years of experience developing and facilitating training that builds knowledge, skills, and performance. Brings a scholar-practitioner foundation in grounded theory research, curriculum development, and learner assessment alongside enterprise project leadership, Agile/Scrum delivery, and data-informed decision-making. Certified ScrumMaster (CSM) with an active federal security clearance and experience leading cross-functional teams and knowledge-transfer initiatives in complex environments. Applies educational leadership and program-development expertise to teaching, learning, and organizational effectiveness in higher education.</w:t>
       </w:r>
     </w:p>
     <w:p>
@@ -365,18 +376,22 @@
           <w:b/>
           <w:bCs/>
         </w:rPr>
-        <w:t>Doctor of Education (EdD)</w:t>
-      </w:r>
-      <w:r>
-        <w:t xml:space="preserve"> — Doctoral Candidate (</w:t>
+        <w:t xml:space="preserve">Doctor of Education (EdD) in Educational </w:t>
       </w:r>
       <w:proofErr w:type="gramStart"/>
       <w:r>
-        <w:t>ABD)  |</w:t>
+        <w:rPr>
+          <w:b/>
+          <w:bCs/>
+        </w:rPr>
+        <w:t>Leadership</w:t>
+      </w:r>
+      <w:r>
+        <w:t xml:space="preserve">  |</w:t>
       </w:r>
       <w:proofErr w:type="gramEnd"/>
       <w:r>
-        <w:t xml:space="preserve">  Expected </w:t>
+        <w:t xml:space="preserve">  </w:t>
       </w:r>
       <w:proofErr w:type="gramStart"/>
       <w:r>
@@ -508,7 +523,7 @@
           <w:i/>
           <w:iCs/>
         </w:rPr>
-        <w:t>January 2022 – Present</w:t>
+        <w:t>January 2022 – August 2026</w:t>
       </w:r>
     </w:p>
     <w:p>
@@ -536,7 +551,7 @@
         <w:spacing w:after="60" w:line="252" w:lineRule="auto"/>
       </w:pPr>
       <w:r>
-        <w:t xml:space="preserve">Build stakeholder capability across the Department of Veterans Affairs EHRM program by designing training materials, job aids, and process documentation that equipped analysts and program staff to adopt new project tracking, issue-management, and reporting workflows during the enterprise transition of 170+ medical facilities from the legacy </w:t>
+        <w:t xml:space="preserve">Built stakeholder capability across the Department of Veterans Affairs EHRM program by designing training materials, job aids, and process documentation that equipped analysts and program staff to adopt new project tracking, issue-management, and reporting workflows during the enterprise transition of 170+ medical facilities from the legacy </w:t>
       </w:r>
       <w:proofErr w:type="spellStart"/>
       <w:r>
@@ -557,20 +572,20 @@
         <w:spacing w:after="60" w:line="252" w:lineRule="auto"/>
       </w:pPr>
       <w:r>
-        <w:t>Design and maintain executive-level Power BI dashboards — including the Deployment Support Operations (DSO) and Event dashboards built with Power Query and DAX — translating complex OIT operational data into clear, actionable insights for cross-functional stakeholders and program leadership.</w:t>
-      </w:r>
-    </w:p>
-    <w:p>
-      <w:pPr>
-        <w:pStyle w:val="ListParagraph"/>
-        <w:numPr>
-          <w:ilvl w:val="0"/>
-          <w:numId w:val="1"/>
-        </w:numPr>
-        <w:spacing w:after="60" w:line="252" w:lineRule="auto"/>
-      </w:pPr>
-      <w:r>
-        <w:t>Conduct root cause analyses on recurring enterprise IT operations issues, synthesizing data from multiple sources to identify systemic patterns, document knowledge-</w:t>
+        <w:t>Designed and maintained executive-level Power BI dashboards — including the Deployment Support Operations (DSO) and Event dashboards built with Power Query and DAX — translating complex OIT operational data into clear, actionable insights for cross-functional stakeholders and program leadership.</w:t>
+      </w:r>
+    </w:p>
+    <w:p>
+      <w:pPr>
+        <w:pStyle w:val="ListParagraph"/>
+        <w:numPr>
+          <w:ilvl w:val="0"/>
+          <w:numId w:val="1"/>
+        </w:numPr>
+        <w:spacing w:after="60" w:line="252" w:lineRule="auto"/>
+      </w:pPr>
+      <w:r>
+        <w:t>Conducted root cause analyses on recurring enterprise IT operations issues, synthesizing data from multiple sources to identify systemic patterns, document knowledge-</w:t>
       </w:r>
       <w:proofErr w:type="spellStart"/>
       <w:r>
@@ -599,7 +614,7 @@
         <w:spacing w:after="60" w:line="252" w:lineRule="auto"/>
       </w:pPr>
       <w:r>
-        <w:t>Leverage generative AI, prompt engineering, and Power Platform low-code automation to accelerate documentation, prototype reporting workflows, and reduce manual effort on routine analytical tasks — improving turnaround and stakeholder deliverable quality.</w:t>
+        <w:t>Leveraged generative AI, prompt engineering, and Power Platform low-code automation to accelerate documentation, prototype reporting workflows, and reduce manual effort on routine analytical tasks — improving turnaround and stakeholder deliverable quality.</w:t>
       </w:r>
     </w:p>
     <w:p>
@@ -613,7 +628,7 @@
       </w:pPr>
       <w:r>
         <w:lastRenderedPageBreak/>
-        <w:t>Preserve institutional knowledge and operational continuity across contract and team transitions, authoring handoff documentation, methodology artifacts, and standardized reporting workflows that enabled incoming teams to sustain program deliverables without interruption.</w:t>
+        <w:t>Preserved institutional knowledge and operational continuity across contract and team transitions, authoring handoff documentation, methodology artifacts, and standardized reporting workflows that enabled incoming teams to sustain program deliverables without interruption.</w:t>
       </w:r>
     </w:p>
     <w:p>

</xml_diff>